<commit_message>
Align Codes package with BJC submission and ul-mds GitHub repository.
Use repo-relative data paths, BJC figure/table mapping in docs, updated supplementary outputs, and the new code availability URL.
</commit_message>
<xml_diff>
--- a/Supplementary/REMARK_checklist.docx
+++ b/Supplementary/REMARK_checklist.docx
@@ -7,7 +7,7 @@
         <w:pStyle w:val="Heading1"/>
       </w:pPr>
       <w:r>
-        <w:t>REMARK Checklist — Exploratory Prognostic Biomarker Analyses</w:t>
+        <w:t>REMARK Checklist — Putative Prognostic Biomarker Analyses</w:t>
       </w:r>
     </w:p>
     <w:p>
@@ -84,7 +84,7 @@
           </w:tcPr>
           <w:p>
             <w:r>
-              <w:t>Marker examined: DNA methylation (EPIC array β-values) at gene/probe level integrated with mRNA and protein; six exploratory prognostic biomarkers (B4GALT1, EGFR, VASP, GFPT2, PHF11, TSPYL5). Objectives: map methylation–expression–protein cascades and prioritise prognostic candidates. Pre-specified hypotheses: not formally pre-registered; biomarker survival associations were exploratory.</w:t>
+              <w:t>Marker examined: DNA methylation (EPIC array β-values) at gene/probe level integrated with mRNA and protein; six putative prognostic biomarkers (B4GALT1, EGFR, VASP, GFPT2, PHF11, TSPYL5). Objectives: describe the correlative methylation–mRNA–protein pattern and prioritise prognostic candidates. Pre-specified hypotheses: not formally pre-registered; biomarker survival associations are putative.</w:t>
             </w:r>
           </w:p>
         </w:tc>
@@ -304,7 +304,7 @@
           </w:tcPr>
           <w:p>
             <w:r>
-              <w:t>Univariate and multivariate analyses reported; exploratory gene-wide scans without multiplicity correction (uncorrected p-values stated).</w:t>
+              <w:t>Univariate and multivariate analyses reported; secondary gene-wide scans without multiplicity correction (uncorrected p-values stated).</w:t>
             </w:r>
           </w:p>
         </w:tc>
@@ -392,7 +392,7 @@
           </w:tcPr>
           <w:p>
             <w:r>
-              <w:t>Interpretation accounts for single discovery cohort and exploratory biomarker framework.</w:t>
+              <w:t>Interpretation accounts for a single discovery cohort and the putative status of the biomarkers.</w:t>
             </w:r>
           </w:p>
         </w:tc>

</xml_diff>